<commit_message>
docs: update mock sprint completion records
</commit_message>
<xml_diff>
--- a/docs/01 - Microsoft AI-Powered Cybersecurity App - Team A_MASTER DOCUMENT.docx
+++ b/docs/01 - Microsoft AI-Powered Cybersecurity App - Team A_MASTER DOCUMENT.docx
@@ -1708,6 +1708,15 @@
         <w:spacing w:before="240" w:beforeAutospacing="off" w:after="240" w:afterAutospacing="off"/>
       </w:pPr>
       <w:r>
+        <w:t>Done: Implemented the approved Fluent styling for the existing sign-in page without changing the authentication flow, validation or session handling. The shared authentication-layout title was corrected after review, the required checks passed, and pull request #10 was merged into main.</w:t>
+      </w:r>
+    </w:p>
+    <w:p>
+      <w:pPr>
+        <w:bidi w:val="0"/>
+        <w:spacing w:before="240" w:beforeAutospacing="off" w:after="240" w:afterAutospacing="off"/>
+      </w:pPr>
+      <w:r>
         <w:rPr>
           <w:rFonts w:ascii="Calibri" w:hAnsi="Calibri" w:eastAsia="Calibri" w:cs="Calibri"/>
           <w:b w:val="1"/>
@@ -1718,7 +1727,7 @@
           <w:szCs w:val="24"/>
           <w:lang w:val="en-GB"/>
         </w:rPr>
-        <w:t>In review:</w:t>
+        <w:t>Deliverable:</w:t>
       </w:r>
       <w:r>
         <w:rPr>
@@ -1729,7 +1738,7 @@
           <w:szCs w:val="24"/>
           <w:lang w:val="en-GB"/>
         </w:rPr>
-        <w:t xml:space="preserve"> Implemented the approved Fluent styling for the existing sign-in page without changing the authentication flow, validation or session handling. TypeScript and lint checks pass. Pull request #10 is open in Reviewing. Jiong has requested one small change to the shared auth-layout page title before approval.</w:t>
+        <w:t xml:space="preserve"> Login-page styling changes and shared AppBrand component in pull request #10.</w:t>
       </w:r>
     </w:p>
     <w:p>
@@ -1738,58 +1747,7 @@
         <w:spacing w:before="240" w:beforeAutospacing="off" w:after="240" w:afterAutospacing="off"/>
       </w:pPr>
       <w:r>
-        <w:rPr>
-          <w:rFonts w:ascii="Calibri" w:hAnsi="Calibri" w:eastAsia="Calibri" w:cs="Calibri"/>
-          <w:b w:val="1"/>
-          <w:bCs w:val="1"/>
-          <w:noProof w:val="0"/>
-          <w:color w:val="000000" w:themeColor="text1" w:themeTint="FF" w:themeShade="FF"/>
-          <w:sz w:val="24"/>
-          <w:szCs w:val="24"/>
-          <w:lang w:val="en-GB"/>
-        </w:rPr>
-        <w:t>Deliverable:</w:t>
-      </w:r>
-      <w:r>
-        <w:rPr>
-          <w:rFonts w:ascii="Calibri" w:hAnsi="Calibri" w:eastAsia="Calibri" w:cs="Calibri"/>
-          <w:noProof w:val="0"/>
-          <w:color w:val="000000" w:themeColor="text1" w:themeTint="FF" w:themeShade="FF"/>
-          <w:sz w:val="24"/>
-          <w:szCs w:val="24"/>
-          <w:lang w:val="en-GB"/>
-        </w:rPr>
-        <w:t xml:space="preserve"> Login-page styling changes and shared AppBrand component in pull request #10.</w:t>
-      </w:r>
-    </w:p>
-    <w:p>
-      <w:pPr>
-        <w:bidi w:val="0"/>
-        <w:spacing w:before="240" w:beforeAutospacing="off" w:after="240" w:afterAutospacing="off"/>
-      </w:pPr>
-      <w:r>
-        <w:rPr>
-          <w:rFonts w:ascii="Calibri" w:hAnsi="Calibri" w:eastAsia="Calibri" w:cs="Calibri"/>
-          <w:b w:val="1"/>
-          <w:bCs w:val="1"/>
-          <w:noProof w:val="0"/>
-          <w:color w:val="000000" w:themeColor="text1" w:themeTint="FF" w:themeShade="FF"/>
-          <w:sz w:val="24"/>
-          <w:szCs w:val="24"/>
-          <w:lang w:val="en-GB"/>
-        </w:rPr>
-        <w:t>Note for next role:</w:t>
-      </w:r>
-      <w:r>
-        <w:rPr>
-          <w:rFonts w:ascii="Calibri" w:hAnsi="Calibri" w:eastAsia="Calibri" w:cs="Calibri"/>
-          <w:noProof w:val="0"/>
-          <w:color w:val="000000" w:themeColor="text1" w:themeTint="FF" w:themeShade="FF"/>
-          <w:sz w:val="24"/>
-          <w:szCs w:val="24"/>
-          <w:lang w:val="en-GB"/>
-        </w:rPr>
-        <w:t xml:space="preserve"> Manthan should address the metadata-title review comment. Jiong can then re-test the page and the PM can complete the final review.</w:t>
+        <w:t>Note for next role: The login styling is complete and merged. The final flow can now be checked together with the team-page redirect and deployment.</w:t>
       </w:r>
     </w:p>
     <w:p>
@@ -2025,6 +1983,15 @@
         <w:spacing w:before="240" w:beforeAutospacing="off" w:after="240" w:afterAutospacing="off"/>
       </w:pPr>
       <w:r>
+        <w:t>Done: Added the protected team page, five-member roster, blurb validation, photo fallbacks and redirect to the team page after sign-in. The minor merge conflict was resolved, pull request #12 was merged into main, final team content was added, and the page was included in the live deployment.</w:t>
+      </w:r>
+    </w:p>
+    <w:p>
+      <w:pPr>
+        <w:bidi w:val="0"/>
+        <w:spacing w:before="240" w:beforeAutospacing="off" w:after="240" w:afterAutospacing="off"/>
+      </w:pPr>
+      <w:r>
         <w:rPr>
           <w:rFonts w:ascii="Calibri" w:hAnsi="Calibri" w:eastAsia="Calibri" w:cs="Calibri"/>
           <w:b w:val="1"/>
@@ -2035,7 +2002,7 @@
           <w:szCs w:val="24"/>
           <w:lang w:val="en-GB"/>
         </w:rPr>
-        <w:t>In review:</w:t>
+        <w:t>Deliverable:</w:t>
       </w:r>
       <w:r>
         <w:rPr>
@@ -2046,7 +2013,7 @@
           <w:szCs w:val="24"/>
           <w:lang w:val="en-GB"/>
         </w:rPr>
-        <w:t xml:space="preserve"> Added a protected team page, a five-member roster, 200-character blurb validation, photo fallbacks using member initials, and a redirect to the team page after sign-in. TypeScript and lint checks pass. Pull request #12 is open and will be reviewed after pull request #10.</w:t>
+        <w:t xml:space="preserve"> Team page and authentication redirect in pull request #12.</w:t>
       </w:r>
     </w:p>
     <w:p>
@@ -2055,58 +2022,7 @@
         <w:spacing w:before="240" w:beforeAutospacing="off" w:after="240" w:afterAutospacing="off"/>
       </w:pPr>
       <w:r>
-        <w:rPr>
-          <w:rFonts w:ascii="Calibri" w:hAnsi="Calibri" w:eastAsia="Calibri" w:cs="Calibri"/>
-          <w:b w:val="1"/>
-          <w:bCs w:val="1"/>
-          <w:noProof w:val="0"/>
-          <w:color w:val="000000" w:themeColor="text1" w:themeTint="FF" w:themeShade="FF"/>
-          <w:sz w:val="24"/>
-          <w:szCs w:val="24"/>
-          <w:lang w:val="en-GB"/>
-        </w:rPr>
-        <w:t>Deliverable:</w:t>
-      </w:r>
-      <w:r>
-        <w:rPr>
-          <w:rFonts w:ascii="Calibri" w:hAnsi="Calibri" w:eastAsia="Calibri" w:cs="Calibri"/>
-          <w:noProof w:val="0"/>
-          <w:color w:val="000000" w:themeColor="text1" w:themeTint="FF" w:themeShade="FF"/>
-          <w:sz w:val="24"/>
-          <w:szCs w:val="24"/>
-          <w:lang w:val="en-GB"/>
-        </w:rPr>
-        <w:t xml:space="preserve"> Team page and authentication redirect in pull request #12.</w:t>
-      </w:r>
-    </w:p>
-    <w:p>
-      <w:pPr>
-        <w:bidi w:val="0"/>
-        <w:spacing w:before="240" w:beforeAutospacing="off" w:after="240" w:afterAutospacing="off"/>
-      </w:pPr>
-      <w:r>
-        <w:rPr>
-          <w:rFonts w:ascii="Calibri" w:hAnsi="Calibri" w:eastAsia="Calibri" w:cs="Calibri"/>
-          <w:b w:val="1"/>
-          <w:bCs w:val="1"/>
-          <w:noProof w:val="0"/>
-          <w:color w:val="000000" w:themeColor="text1" w:themeTint="FF" w:themeShade="FF"/>
-          <w:sz w:val="24"/>
-          <w:szCs w:val="24"/>
-          <w:lang w:val="en-GB"/>
-        </w:rPr>
-        <w:t>Note for next role:</w:t>
-      </w:r>
-      <w:r>
-        <w:rPr>
-          <w:rFonts w:ascii="Calibri" w:hAnsi="Calibri" w:eastAsia="Calibri" w:cs="Calibri"/>
-          <w:noProof w:val="0"/>
-          <w:color w:val="000000" w:themeColor="text1" w:themeTint="FF" w:themeShade="FF"/>
-          <w:sz w:val="24"/>
-          <w:szCs w:val="24"/>
-          <w:lang w:val="en-GB"/>
-        </w:rPr>
-        <w:t xml:space="preserve"> Jiong should review and test pull request #12 after pull request #10 is resolved. Final team content and photos can be confirmed before the PM completes the merge.</w:t>
+        <w:t>Note for next role: The team page and authentication redirect are complete. QA and the PM can verify the merged flow at the deployed site.</w:t>
       </w:r>
     </w:p>
     <w:p>
@@ -2342,6 +2258,15 @@
         <w:spacing w:before="240" w:beforeAutospacing="off" w:after="240" w:afterAutospacing="off"/>
       </w:pPr>
       <w:r>
+        <w:t>Done: Tested empty submission, malformed email, invalid credentials and protected-route behaviour. The redirect and shared authentication-layout issues raised during review were addressed before the related pull requests were merged. The Planner checklist was completed and the card was moved to Done.</w:t>
+      </w:r>
+    </w:p>
+    <w:p>
+      <w:pPr>
+        <w:bidi w:val="0"/>
+        <w:spacing w:before="240" w:beforeAutospacing="off" w:after="240" w:afterAutospacing="off"/>
+      </w:pPr>
+      <w:r>
         <w:rPr>
           <w:rFonts w:ascii="Calibri" w:hAnsi="Calibri" w:eastAsia="Calibri" w:cs="Calibri"/>
           <w:b w:val="1"/>
@@ -2352,7 +2277,7 @@
           <w:szCs w:val="24"/>
           <w:lang w:val="en-GB"/>
         </w:rPr>
-        <w:t>Testing complete:</w:t>
+        <w:t>Deliverable:</w:t>
       </w:r>
       <w:r>
         <w:rPr>
@@ -2363,7 +2288,7 @@
           <w:szCs w:val="24"/>
           <w:lang w:val="en-GB"/>
         </w:rPr>
-        <w:t xml:space="preserve"> Tested empty submission, malformed email, invalid credentials and protected-route behaviour. Valid sign-in also passed. One redirect issue was logged: after visiting the protected profile page, successful sign-in sends the user to the dashboard instead of returning to the profile page. Jiong also submitted a requested-change review on pull request #10 for the shared auth-layout page title.</w:t>
+        <w:t xml:space="preserve"> Test evidence recorded at docs/test-evidence/JR-login-page-restyle-test.md and a GitHub review on pull request #10.</w:t>
       </w:r>
     </w:p>
     <w:p>
@@ -2372,58 +2297,7 @@
         <w:spacing w:before="240" w:beforeAutospacing="off" w:after="240" w:afterAutospacing="off"/>
       </w:pPr>
       <w:r>
-        <w:rPr>
-          <w:rFonts w:ascii="Calibri" w:hAnsi="Calibri" w:eastAsia="Calibri" w:cs="Calibri"/>
-          <w:b w:val="1"/>
-          <w:bCs w:val="1"/>
-          <w:noProof w:val="0"/>
-          <w:color w:val="000000" w:themeColor="text1" w:themeTint="FF" w:themeShade="FF"/>
-          <w:sz w:val="24"/>
-          <w:szCs w:val="24"/>
-          <w:lang w:val="en-GB"/>
-        </w:rPr>
-        <w:t>Deliverable:</w:t>
-      </w:r>
-      <w:r>
-        <w:rPr>
-          <w:rFonts w:ascii="Calibri" w:hAnsi="Calibri" w:eastAsia="Calibri" w:cs="Calibri"/>
-          <w:noProof w:val="0"/>
-          <w:color w:val="000000" w:themeColor="text1" w:themeTint="FF" w:themeShade="FF"/>
-          <w:sz w:val="24"/>
-          <w:szCs w:val="24"/>
-          <w:lang w:val="en-GB"/>
-        </w:rPr>
-        <w:t xml:space="preserve"> Test evidence recorded at docs/test-evidence/JR-login-page-restyle-test.md and a GitHub review on pull request #10.</w:t>
-      </w:r>
-    </w:p>
-    <w:p>
-      <w:pPr>
-        <w:bidi w:val="0"/>
-        <w:spacing w:before="240" w:beforeAutospacing="off" w:after="240" w:afterAutospacing="off"/>
-      </w:pPr>
-      <w:r>
-        <w:rPr>
-          <w:rFonts w:ascii="Calibri" w:hAnsi="Calibri" w:eastAsia="Calibri" w:cs="Calibri"/>
-          <w:b w:val="1"/>
-          <w:bCs w:val="1"/>
-          <w:noProof w:val="0"/>
-          <w:color w:val="000000" w:themeColor="text1" w:themeTint="FF" w:themeShade="FF"/>
-          <w:sz w:val="24"/>
-          <w:szCs w:val="24"/>
-          <w:lang w:val="en-GB"/>
-        </w:rPr>
-        <w:t>Note for next role:</w:t>
-      </w:r>
-      <w:r>
-        <w:rPr>
-          <w:rFonts w:ascii="Calibri" w:hAnsi="Calibri" w:eastAsia="Calibri" w:cs="Calibri"/>
-          <w:noProof w:val="0"/>
-          <w:color w:val="000000" w:themeColor="text1" w:themeTint="FF" w:themeShade="FF"/>
-          <w:sz w:val="24"/>
-          <w:szCs w:val="24"/>
-          <w:lang w:val="en-GB"/>
-        </w:rPr>
-        <w:t xml:space="preserve"> Manthan should address the review comment and confirm the redirect behaviour. Jiong can then re-test the affected flow.</w:t>
+        <w:t>Note for next role: Edge-case testing is complete. The evidence remains in the repository for the PM's final review and sign-off.</w:t>
       </w:r>
     </w:p>
     <w:p>
@@ -2659,6 +2533,15 @@
         <w:spacing w:before="240" w:beforeAutospacing="off" w:after="240" w:afterAutospacing="off"/>
       </w:pPr>
       <w:r>
+        <w:t>Done: Tested valid email sign-in, redirect to the team page, team-member content, missing-photo fallbacks and long-blurb display. The final merged flow passed the recorded checks, the Planner checklist was completed, and the card was moved to Done.</w:t>
+      </w:r>
+    </w:p>
+    <w:p>
+      <w:pPr>
+        <w:bidi w:val="0"/>
+        <w:spacing w:before="240" w:beforeAutospacing="off" w:after="240" w:afterAutospacing="off"/>
+      </w:pPr>
+      <w:r>
         <w:rPr>
           <w:rFonts w:ascii="Calibri" w:hAnsi="Calibri" w:eastAsia="Calibri" w:cs="Calibri"/>
           <w:b w:val="1"/>
@@ -2669,7 +2552,7 @@
           <w:szCs w:val="24"/>
           <w:lang w:val="en-GB"/>
         </w:rPr>
-        <w:t>Testing complete:</w:t>
+        <w:t>Deliverable:</w:t>
       </w:r>
       <w:r>
         <w:rPr>
@@ -2680,7 +2563,7 @@
           <w:szCs w:val="24"/>
           <w:lang w:val="en-GB"/>
         </w:rPr>
-        <w:t xml:space="preserve"> Tested valid email sign-in, the redirect to the team page, team-member content, the missing-photo fallback and long-blurb display. These checks passed. The card remains in Reviewing because pull request #12 is still open and the final review and merge are pending.</w:t>
+        <w:t xml:space="preserve"> Test evidence recorded at docs/test-evidence/JR-login-team-page-test.md.</w:t>
       </w:r>
     </w:p>
     <w:p>
@@ -2689,58 +2572,7 @@
         <w:spacing w:before="240" w:beforeAutospacing="off" w:after="240" w:afterAutospacing="off"/>
       </w:pPr>
       <w:r>
-        <w:rPr>
-          <w:rFonts w:ascii="Calibri" w:hAnsi="Calibri" w:eastAsia="Calibri" w:cs="Calibri"/>
-          <w:b w:val="1"/>
-          <w:bCs w:val="1"/>
-          <w:noProof w:val="0"/>
-          <w:color w:val="000000" w:themeColor="text1" w:themeTint="FF" w:themeShade="FF"/>
-          <w:sz w:val="24"/>
-          <w:szCs w:val="24"/>
-          <w:lang w:val="en-GB"/>
-        </w:rPr>
-        <w:t>Deliverable:</w:t>
-      </w:r>
-      <w:r>
-        <w:rPr>
-          <w:rFonts w:ascii="Calibri" w:hAnsi="Calibri" w:eastAsia="Calibri" w:cs="Calibri"/>
-          <w:noProof w:val="0"/>
-          <w:color w:val="000000" w:themeColor="text1" w:themeTint="FF" w:themeShade="FF"/>
-          <w:sz w:val="24"/>
-          <w:szCs w:val="24"/>
-          <w:lang w:val="en-GB"/>
-        </w:rPr>
-        <w:t xml:space="preserve"> Test evidence recorded at docs/test-evidence/JR-login-team-page-test.md.</w:t>
-      </w:r>
-    </w:p>
-    <w:p>
-      <w:pPr>
-        <w:bidi w:val="0"/>
-        <w:spacing w:before="240" w:beforeAutospacing="off" w:after="240" w:afterAutospacing="off"/>
-      </w:pPr>
-      <w:r>
-        <w:rPr>
-          <w:rFonts w:ascii="Calibri" w:hAnsi="Calibri" w:eastAsia="Calibri" w:cs="Calibri"/>
-          <w:b w:val="1"/>
-          <w:bCs w:val="1"/>
-          <w:noProof w:val="0"/>
-          <w:color w:val="000000" w:themeColor="text1" w:themeTint="FF" w:themeShade="FF"/>
-          <w:sz w:val="24"/>
-          <w:szCs w:val="24"/>
-          <w:lang w:val="en-GB"/>
-        </w:rPr>
-        <w:t>Note for next role:</w:t>
-      </w:r>
-      <w:r>
-        <w:rPr>
-          <w:rFonts w:ascii="Calibri" w:hAnsi="Calibri" w:eastAsia="Calibri" w:cs="Calibri"/>
-          <w:noProof w:val="0"/>
-          <w:color w:val="000000" w:themeColor="text1" w:themeTint="FF" w:themeShade="FF"/>
-          <w:sz w:val="24"/>
-          <w:szCs w:val="24"/>
-          <w:lang w:val="en-GB"/>
-        </w:rPr>
-        <w:t xml:space="preserve"> Complete the pull request #12 review after pull request #10 is resolved. The PM can then merge the changes in order.</w:t>
+        <w:t>Note for next role: Happy-path testing is complete. The PM can use the recorded evidence and live site for final review and sign-off.</w:t>
       </w:r>
     </w:p>
     <w:p>

</xml_diff>

<commit_message>
docs: update mock sprint completion records (#18)
</commit_message>
<xml_diff>
--- a/docs/01 - Microsoft AI-Powered Cybersecurity App - Team A_MASTER DOCUMENT.docx
+++ b/docs/01 - Microsoft AI-Powered Cybersecurity App - Team A_MASTER DOCUMENT.docx
@@ -1708,6 +1708,15 @@
         <w:spacing w:before="240" w:beforeAutospacing="off" w:after="240" w:afterAutospacing="off"/>
       </w:pPr>
       <w:r>
+        <w:t>Done: Implemented the approved Fluent styling for the existing sign-in page without changing the authentication flow, validation or session handling. The shared authentication-layout title was corrected after review, the required checks passed, and pull request #10 was merged into main.</w:t>
+      </w:r>
+    </w:p>
+    <w:p>
+      <w:pPr>
+        <w:bidi w:val="0"/>
+        <w:spacing w:before="240" w:beforeAutospacing="off" w:after="240" w:afterAutospacing="off"/>
+      </w:pPr>
+      <w:r>
         <w:rPr>
           <w:rFonts w:ascii="Calibri" w:hAnsi="Calibri" w:eastAsia="Calibri" w:cs="Calibri"/>
           <w:b w:val="1"/>
@@ -1718,7 +1727,7 @@
           <w:szCs w:val="24"/>
           <w:lang w:val="en-GB"/>
         </w:rPr>
-        <w:t>In review:</w:t>
+        <w:t>Deliverable:</w:t>
       </w:r>
       <w:r>
         <w:rPr>
@@ -1729,7 +1738,7 @@
           <w:szCs w:val="24"/>
           <w:lang w:val="en-GB"/>
         </w:rPr>
-        <w:t xml:space="preserve"> Implemented the approved Fluent styling for the existing sign-in page without changing the authentication flow, validation or session handling. TypeScript and lint checks pass. Pull request #10 is open in Reviewing. Jiong has requested one small change to the shared auth-layout page title before approval.</w:t>
+        <w:t xml:space="preserve"> Login-page styling changes and shared AppBrand component in pull request #10.</w:t>
       </w:r>
     </w:p>
     <w:p>
@@ -1738,58 +1747,7 @@
         <w:spacing w:before="240" w:beforeAutospacing="off" w:after="240" w:afterAutospacing="off"/>
       </w:pPr>
       <w:r>
-        <w:rPr>
-          <w:rFonts w:ascii="Calibri" w:hAnsi="Calibri" w:eastAsia="Calibri" w:cs="Calibri"/>
-          <w:b w:val="1"/>
-          <w:bCs w:val="1"/>
-          <w:noProof w:val="0"/>
-          <w:color w:val="000000" w:themeColor="text1" w:themeTint="FF" w:themeShade="FF"/>
-          <w:sz w:val="24"/>
-          <w:szCs w:val="24"/>
-          <w:lang w:val="en-GB"/>
-        </w:rPr>
-        <w:t>Deliverable:</w:t>
-      </w:r>
-      <w:r>
-        <w:rPr>
-          <w:rFonts w:ascii="Calibri" w:hAnsi="Calibri" w:eastAsia="Calibri" w:cs="Calibri"/>
-          <w:noProof w:val="0"/>
-          <w:color w:val="000000" w:themeColor="text1" w:themeTint="FF" w:themeShade="FF"/>
-          <w:sz w:val="24"/>
-          <w:szCs w:val="24"/>
-          <w:lang w:val="en-GB"/>
-        </w:rPr>
-        <w:t xml:space="preserve"> Login-page styling changes and shared AppBrand component in pull request #10.</w:t>
-      </w:r>
-    </w:p>
-    <w:p>
-      <w:pPr>
-        <w:bidi w:val="0"/>
-        <w:spacing w:before="240" w:beforeAutospacing="off" w:after="240" w:afterAutospacing="off"/>
-      </w:pPr>
-      <w:r>
-        <w:rPr>
-          <w:rFonts w:ascii="Calibri" w:hAnsi="Calibri" w:eastAsia="Calibri" w:cs="Calibri"/>
-          <w:b w:val="1"/>
-          <w:bCs w:val="1"/>
-          <w:noProof w:val="0"/>
-          <w:color w:val="000000" w:themeColor="text1" w:themeTint="FF" w:themeShade="FF"/>
-          <w:sz w:val="24"/>
-          <w:szCs w:val="24"/>
-          <w:lang w:val="en-GB"/>
-        </w:rPr>
-        <w:t>Note for next role:</w:t>
-      </w:r>
-      <w:r>
-        <w:rPr>
-          <w:rFonts w:ascii="Calibri" w:hAnsi="Calibri" w:eastAsia="Calibri" w:cs="Calibri"/>
-          <w:noProof w:val="0"/>
-          <w:color w:val="000000" w:themeColor="text1" w:themeTint="FF" w:themeShade="FF"/>
-          <w:sz w:val="24"/>
-          <w:szCs w:val="24"/>
-          <w:lang w:val="en-GB"/>
-        </w:rPr>
-        <w:t xml:space="preserve"> Manthan should address the metadata-title review comment. Jiong can then re-test the page and the PM can complete the final review.</w:t>
+        <w:t>Note for next role: The login styling is complete and merged. The final flow can now be checked together with the team-page redirect and deployment.</w:t>
       </w:r>
     </w:p>
     <w:p>
@@ -2025,6 +1983,15 @@
         <w:spacing w:before="240" w:beforeAutospacing="off" w:after="240" w:afterAutospacing="off"/>
       </w:pPr>
       <w:r>
+        <w:t>Done: Added the protected team page, five-member roster, blurb validation, photo fallbacks and redirect to the team page after sign-in. The minor merge conflict was resolved, pull request #12 was merged into main, final team content was added, and the page was included in the live deployment.</w:t>
+      </w:r>
+    </w:p>
+    <w:p>
+      <w:pPr>
+        <w:bidi w:val="0"/>
+        <w:spacing w:before="240" w:beforeAutospacing="off" w:after="240" w:afterAutospacing="off"/>
+      </w:pPr>
+      <w:r>
         <w:rPr>
           <w:rFonts w:ascii="Calibri" w:hAnsi="Calibri" w:eastAsia="Calibri" w:cs="Calibri"/>
           <w:b w:val="1"/>
@@ -2035,7 +2002,7 @@
           <w:szCs w:val="24"/>
           <w:lang w:val="en-GB"/>
         </w:rPr>
-        <w:t>In review:</w:t>
+        <w:t>Deliverable:</w:t>
       </w:r>
       <w:r>
         <w:rPr>
@@ -2046,7 +2013,7 @@
           <w:szCs w:val="24"/>
           <w:lang w:val="en-GB"/>
         </w:rPr>
-        <w:t xml:space="preserve"> Added a protected team page, a five-member roster, 200-character blurb validation, photo fallbacks using member initials, and a redirect to the team page after sign-in. TypeScript and lint checks pass. Pull request #12 is open and will be reviewed after pull request #10.</w:t>
+        <w:t xml:space="preserve"> Team page and authentication redirect in pull request #12.</w:t>
       </w:r>
     </w:p>
     <w:p>
@@ -2055,58 +2022,7 @@
         <w:spacing w:before="240" w:beforeAutospacing="off" w:after="240" w:afterAutospacing="off"/>
       </w:pPr>
       <w:r>
-        <w:rPr>
-          <w:rFonts w:ascii="Calibri" w:hAnsi="Calibri" w:eastAsia="Calibri" w:cs="Calibri"/>
-          <w:b w:val="1"/>
-          <w:bCs w:val="1"/>
-          <w:noProof w:val="0"/>
-          <w:color w:val="000000" w:themeColor="text1" w:themeTint="FF" w:themeShade="FF"/>
-          <w:sz w:val="24"/>
-          <w:szCs w:val="24"/>
-          <w:lang w:val="en-GB"/>
-        </w:rPr>
-        <w:t>Deliverable:</w:t>
-      </w:r>
-      <w:r>
-        <w:rPr>
-          <w:rFonts w:ascii="Calibri" w:hAnsi="Calibri" w:eastAsia="Calibri" w:cs="Calibri"/>
-          <w:noProof w:val="0"/>
-          <w:color w:val="000000" w:themeColor="text1" w:themeTint="FF" w:themeShade="FF"/>
-          <w:sz w:val="24"/>
-          <w:szCs w:val="24"/>
-          <w:lang w:val="en-GB"/>
-        </w:rPr>
-        <w:t xml:space="preserve"> Team page and authentication redirect in pull request #12.</w:t>
-      </w:r>
-    </w:p>
-    <w:p>
-      <w:pPr>
-        <w:bidi w:val="0"/>
-        <w:spacing w:before="240" w:beforeAutospacing="off" w:after="240" w:afterAutospacing="off"/>
-      </w:pPr>
-      <w:r>
-        <w:rPr>
-          <w:rFonts w:ascii="Calibri" w:hAnsi="Calibri" w:eastAsia="Calibri" w:cs="Calibri"/>
-          <w:b w:val="1"/>
-          <w:bCs w:val="1"/>
-          <w:noProof w:val="0"/>
-          <w:color w:val="000000" w:themeColor="text1" w:themeTint="FF" w:themeShade="FF"/>
-          <w:sz w:val="24"/>
-          <w:szCs w:val="24"/>
-          <w:lang w:val="en-GB"/>
-        </w:rPr>
-        <w:t>Note for next role:</w:t>
-      </w:r>
-      <w:r>
-        <w:rPr>
-          <w:rFonts w:ascii="Calibri" w:hAnsi="Calibri" w:eastAsia="Calibri" w:cs="Calibri"/>
-          <w:noProof w:val="0"/>
-          <w:color w:val="000000" w:themeColor="text1" w:themeTint="FF" w:themeShade="FF"/>
-          <w:sz w:val="24"/>
-          <w:szCs w:val="24"/>
-          <w:lang w:val="en-GB"/>
-        </w:rPr>
-        <w:t xml:space="preserve"> Jiong should review and test pull request #12 after pull request #10 is resolved. Final team content and photos can be confirmed before the PM completes the merge.</w:t>
+        <w:t>Note for next role: The team page and authentication redirect are complete. QA and the PM can verify the merged flow at the deployed site.</w:t>
       </w:r>
     </w:p>
     <w:p>
@@ -2342,6 +2258,15 @@
         <w:spacing w:before="240" w:beforeAutospacing="off" w:after="240" w:afterAutospacing="off"/>
       </w:pPr>
       <w:r>
+        <w:t>Done: Tested empty submission, malformed email, invalid credentials and protected-route behaviour. The redirect and shared authentication-layout issues raised during review were addressed before the related pull requests were merged. The Planner checklist was completed and the card was moved to Done.</w:t>
+      </w:r>
+    </w:p>
+    <w:p>
+      <w:pPr>
+        <w:bidi w:val="0"/>
+        <w:spacing w:before="240" w:beforeAutospacing="off" w:after="240" w:afterAutospacing="off"/>
+      </w:pPr>
+      <w:r>
         <w:rPr>
           <w:rFonts w:ascii="Calibri" w:hAnsi="Calibri" w:eastAsia="Calibri" w:cs="Calibri"/>
           <w:b w:val="1"/>
@@ -2352,7 +2277,7 @@
           <w:szCs w:val="24"/>
           <w:lang w:val="en-GB"/>
         </w:rPr>
-        <w:t>Testing complete:</w:t>
+        <w:t>Deliverable:</w:t>
       </w:r>
       <w:r>
         <w:rPr>
@@ -2363,7 +2288,7 @@
           <w:szCs w:val="24"/>
           <w:lang w:val="en-GB"/>
         </w:rPr>
-        <w:t xml:space="preserve"> Tested empty submission, malformed email, invalid credentials and protected-route behaviour. Valid sign-in also passed. One redirect issue was logged: after visiting the protected profile page, successful sign-in sends the user to the dashboard instead of returning to the profile page. Jiong also submitted a requested-change review on pull request #10 for the shared auth-layout page title.</w:t>
+        <w:t xml:space="preserve"> Test evidence recorded at docs/test-evidence/JR-login-page-restyle-test.md and a GitHub review on pull request #10.</w:t>
       </w:r>
     </w:p>
     <w:p>
@@ -2372,58 +2297,7 @@
         <w:spacing w:before="240" w:beforeAutospacing="off" w:after="240" w:afterAutospacing="off"/>
       </w:pPr>
       <w:r>
-        <w:rPr>
-          <w:rFonts w:ascii="Calibri" w:hAnsi="Calibri" w:eastAsia="Calibri" w:cs="Calibri"/>
-          <w:b w:val="1"/>
-          <w:bCs w:val="1"/>
-          <w:noProof w:val="0"/>
-          <w:color w:val="000000" w:themeColor="text1" w:themeTint="FF" w:themeShade="FF"/>
-          <w:sz w:val="24"/>
-          <w:szCs w:val="24"/>
-          <w:lang w:val="en-GB"/>
-        </w:rPr>
-        <w:t>Deliverable:</w:t>
-      </w:r>
-      <w:r>
-        <w:rPr>
-          <w:rFonts w:ascii="Calibri" w:hAnsi="Calibri" w:eastAsia="Calibri" w:cs="Calibri"/>
-          <w:noProof w:val="0"/>
-          <w:color w:val="000000" w:themeColor="text1" w:themeTint="FF" w:themeShade="FF"/>
-          <w:sz w:val="24"/>
-          <w:szCs w:val="24"/>
-          <w:lang w:val="en-GB"/>
-        </w:rPr>
-        <w:t xml:space="preserve"> Test evidence recorded at docs/test-evidence/JR-login-page-restyle-test.md and a GitHub review on pull request #10.</w:t>
-      </w:r>
-    </w:p>
-    <w:p>
-      <w:pPr>
-        <w:bidi w:val="0"/>
-        <w:spacing w:before="240" w:beforeAutospacing="off" w:after="240" w:afterAutospacing="off"/>
-      </w:pPr>
-      <w:r>
-        <w:rPr>
-          <w:rFonts w:ascii="Calibri" w:hAnsi="Calibri" w:eastAsia="Calibri" w:cs="Calibri"/>
-          <w:b w:val="1"/>
-          <w:bCs w:val="1"/>
-          <w:noProof w:val="0"/>
-          <w:color w:val="000000" w:themeColor="text1" w:themeTint="FF" w:themeShade="FF"/>
-          <w:sz w:val="24"/>
-          <w:szCs w:val="24"/>
-          <w:lang w:val="en-GB"/>
-        </w:rPr>
-        <w:t>Note for next role:</w:t>
-      </w:r>
-      <w:r>
-        <w:rPr>
-          <w:rFonts w:ascii="Calibri" w:hAnsi="Calibri" w:eastAsia="Calibri" w:cs="Calibri"/>
-          <w:noProof w:val="0"/>
-          <w:color w:val="000000" w:themeColor="text1" w:themeTint="FF" w:themeShade="FF"/>
-          <w:sz w:val="24"/>
-          <w:szCs w:val="24"/>
-          <w:lang w:val="en-GB"/>
-        </w:rPr>
-        <w:t xml:space="preserve"> Manthan should address the review comment and confirm the redirect behaviour. Jiong can then re-test the affected flow.</w:t>
+        <w:t>Note for next role: Edge-case testing is complete. The evidence remains in the repository for the PM's final review and sign-off.</w:t>
       </w:r>
     </w:p>
     <w:p>
@@ -2659,6 +2533,15 @@
         <w:spacing w:before="240" w:beforeAutospacing="off" w:after="240" w:afterAutospacing="off"/>
       </w:pPr>
       <w:r>
+        <w:t>Done: Tested valid email sign-in, redirect to the team page, team-member content, missing-photo fallbacks and long-blurb display. The final merged flow passed the recorded checks, the Planner checklist was completed, and the card was moved to Done.</w:t>
+      </w:r>
+    </w:p>
+    <w:p>
+      <w:pPr>
+        <w:bidi w:val="0"/>
+        <w:spacing w:before="240" w:beforeAutospacing="off" w:after="240" w:afterAutospacing="off"/>
+      </w:pPr>
+      <w:r>
         <w:rPr>
           <w:rFonts w:ascii="Calibri" w:hAnsi="Calibri" w:eastAsia="Calibri" w:cs="Calibri"/>
           <w:b w:val="1"/>
@@ -2669,7 +2552,7 @@
           <w:szCs w:val="24"/>
           <w:lang w:val="en-GB"/>
         </w:rPr>
-        <w:t>Testing complete:</w:t>
+        <w:t>Deliverable:</w:t>
       </w:r>
       <w:r>
         <w:rPr>
@@ -2680,7 +2563,7 @@
           <w:szCs w:val="24"/>
           <w:lang w:val="en-GB"/>
         </w:rPr>
-        <w:t xml:space="preserve"> Tested valid email sign-in, the redirect to the team page, team-member content, the missing-photo fallback and long-blurb display. These checks passed. The card remains in Reviewing because pull request #12 is still open and the final review and merge are pending.</w:t>
+        <w:t xml:space="preserve"> Test evidence recorded at docs/test-evidence/JR-login-team-page-test.md.</w:t>
       </w:r>
     </w:p>
     <w:p>
@@ -2689,58 +2572,7 @@
         <w:spacing w:before="240" w:beforeAutospacing="off" w:after="240" w:afterAutospacing="off"/>
       </w:pPr>
       <w:r>
-        <w:rPr>
-          <w:rFonts w:ascii="Calibri" w:hAnsi="Calibri" w:eastAsia="Calibri" w:cs="Calibri"/>
-          <w:b w:val="1"/>
-          <w:bCs w:val="1"/>
-          <w:noProof w:val="0"/>
-          <w:color w:val="000000" w:themeColor="text1" w:themeTint="FF" w:themeShade="FF"/>
-          <w:sz w:val="24"/>
-          <w:szCs w:val="24"/>
-          <w:lang w:val="en-GB"/>
-        </w:rPr>
-        <w:t>Deliverable:</w:t>
-      </w:r>
-      <w:r>
-        <w:rPr>
-          <w:rFonts w:ascii="Calibri" w:hAnsi="Calibri" w:eastAsia="Calibri" w:cs="Calibri"/>
-          <w:noProof w:val="0"/>
-          <w:color w:val="000000" w:themeColor="text1" w:themeTint="FF" w:themeShade="FF"/>
-          <w:sz w:val="24"/>
-          <w:szCs w:val="24"/>
-          <w:lang w:val="en-GB"/>
-        </w:rPr>
-        <w:t xml:space="preserve"> Test evidence recorded at docs/test-evidence/JR-login-team-page-test.md.</w:t>
-      </w:r>
-    </w:p>
-    <w:p>
-      <w:pPr>
-        <w:bidi w:val="0"/>
-        <w:spacing w:before="240" w:beforeAutospacing="off" w:after="240" w:afterAutospacing="off"/>
-      </w:pPr>
-      <w:r>
-        <w:rPr>
-          <w:rFonts w:ascii="Calibri" w:hAnsi="Calibri" w:eastAsia="Calibri" w:cs="Calibri"/>
-          <w:b w:val="1"/>
-          <w:bCs w:val="1"/>
-          <w:noProof w:val="0"/>
-          <w:color w:val="000000" w:themeColor="text1" w:themeTint="FF" w:themeShade="FF"/>
-          <w:sz w:val="24"/>
-          <w:szCs w:val="24"/>
-          <w:lang w:val="en-GB"/>
-        </w:rPr>
-        <w:t>Note for next role:</w:t>
-      </w:r>
-      <w:r>
-        <w:rPr>
-          <w:rFonts w:ascii="Calibri" w:hAnsi="Calibri" w:eastAsia="Calibri" w:cs="Calibri"/>
-          <w:noProof w:val="0"/>
-          <w:color w:val="000000" w:themeColor="text1" w:themeTint="FF" w:themeShade="FF"/>
-          <w:sz w:val="24"/>
-          <w:szCs w:val="24"/>
-          <w:lang w:val="en-GB"/>
-        </w:rPr>
-        <w:t xml:space="preserve"> Complete the pull request #12 review after pull request #10 is resolved. The PM can then merge the changes in order.</w:t>
+        <w:t>Note for next role: Happy-path testing is complete. The PM can use the recorded evidence and live site for final review and sign-off.</w:t>
       </w:r>
     </w:p>
     <w:p>

</xml_diff>